<commit_message>
Agrega enlace del repositorio al informe
</commit_message>
<xml_diff>
--- a/Informe_Evaluacion_Backend_Ignacio_Salinas_Diego_Perez.docx
+++ b/Informe_Evaluacion_Backend_Ignacio_Salinas_Diego_Perez.docx
@@ -2620,6 +2620,28 @@
         <w:pStyle w:val="Heading1"/>
       </w:pPr>
       <w:r>
+        <w:t>Repositorio del proyecto</w:t>
+      </w:r>
+    </w:p>
+    <w:p>
+      <w:r>
+        <w:t xml:space="preserve">El código fuente y el informe están disponibles en GitHub: </w:t>
+      </w:r>
+      <w:hyperlink r:id="rId13">
+        <w:r>
+          <w:rPr>
+            <w:color w:val="0563C1"/>
+            <w:u w:val="single"/>
+          </w:rPr>
+          <w:t>github.com/dublind/backend_1</w:t>
+        </w:r>
+      </w:hyperlink>
+    </w:p>
+    <w:p>
+      <w:pPr>
+        <w:pStyle w:val="Heading1"/>
+      </w:pPr>
+      <w:r>
         <w:t>Referencias</w:t>
       </w:r>
     </w:p>

</xml_diff>